<commit_message>
modification de compte rendu
</commit_message>
<xml_diff>
--- a/Compte Rendu_TP_IOT.docx
+++ b/Compte Rendu_TP_IOT.docx
@@ -95,6 +95,137 @@
           </wp:inline>
         </w:drawing>
       </w:r>
+    </w:p>
+    <w:p>
+      <w:pPr>
+        <w:rPr>
+          <w:lang w:val="en-US"/>
+        </w:rPr>
+      </w:pPr>
+      <w:proofErr w:type="spellStart"/>
+      <w:proofErr w:type="gramStart"/>
+      <w:r>
+        <w:rPr>
+          <w:lang w:val="en-US"/>
+        </w:rPr>
+        <w:t>Bargraphe</w:t>
+      </w:r>
+      <w:proofErr w:type="spellEnd"/>
+      <w:r>
+        <w:rPr>
+          <w:lang w:val="en-US"/>
+        </w:rPr>
+        <w:t xml:space="preserve"> :</w:t>
+      </w:r>
+      <w:proofErr w:type="gramEnd"/>
+      <w:r>
+        <w:rPr>
+          <w:lang w:val="en-US"/>
+        </w:rPr>
+        <w:t xml:space="preserve"> </w:t>
+      </w:r>
+    </w:p>
+    <w:p>
+      <w:pPr>
+        <w:rPr>
+          <w:lang w:val="en-US"/>
+        </w:rPr>
+      </w:pPr>
+      <w:r>
+        <w:rPr>
+          <w:lang w:val="en-US"/>
+        </w:rPr>
+        <w:lastRenderedPageBreak/>
+        <w:drawing>
+          <wp:inline distT="0" distB="0" distL="0" distR="0" wp14:anchorId="4FE247C7" wp14:editId="6849718B">
+            <wp:extent cx="5760720" cy="3360420"/>
+            <wp:effectExtent l="0" t="0" r="0" b="0"/>
+            <wp:docPr id="2127152056" name="Image 1"/>
+            <wp:cNvGraphicFramePr>
+              <a:graphicFrameLocks xmlns:a="http://schemas.openxmlformats.org/drawingml/2006/main" noChangeAspect="1"/>
+            </wp:cNvGraphicFramePr>
+            <a:graphic xmlns:a="http://schemas.openxmlformats.org/drawingml/2006/main">
+              <a:graphicData uri="http://schemas.openxmlformats.org/drawingml/2006/picture">
+                <pic:pic xmlns:pic="http://schemas.openxmlformats.org/drawingml/2006/picture">
+                  <pic:nvPicPr>
+                    <pic:cNvPr id="2127152056" name=""/>
+                    <pic:cNvPicPr/>
+                  </pic:nvPicPr>
+                  <pic:blipFill>
+                    <a:blip r:embed="rId6"/>
+                    <a:stretch>
+                      <a:fillRect/>
+                    </a:stretch>
+                  </pic:blipFill>
+                  <pic:spPr>
+                    <a:xfrm>
+                      <a:off x="0" y="0"/>
+                      <a:ext cx="5760720" cy="3360420"/>
+                    </a:xfrm>
+                    <a:prstGeom prst="rect">
+                      <a:avLst/>
+                    </a:prstGeom>
+                  </pic:spPr>
+                </pic:pic>
+              </a:graphicData>
+            </a:graphic>
+          </wp:inline>
+        </w:drawing>
+      </w:r>
+    </w:p>
+    <w:p>
+      <w:pPr>
+        <w:rPr>
+          <w:lang w:val="en-US"/>
+        </w:rPr>
+      </w:pPr>
+      <w:r>
+        <w:rPr>
+          <w:lang w:val="en-US"/>
+        </w:rPr>
+        <w:drawing>
+          <wp:inline distT="0" distB="0" distL="0" distR="0" wp14:anchorId="6B570517" wp14:editId="046B2F8E">
+            <wp:extent cx="5092962" cy="3848298"/>
+            <wp:effectExtent l="0" t="0" r="0" b="0"/>
+            <wp:docPr id="2072601762" name="Image 1"/>
+            <wp:cNvGraphicFramePr>
+              <a:graphicFrameLocks xmlns:a="http://schemas.openxmlformats.org/drawingml/2006/main" noChangeAspect="1"/>
+            </wp:cNvGraphicFramePr>
+            <a:graphic xmlns:a="http://schemas.openxmlformats.org/drawingml/2006/main">
+              <a:graphicData uri="http://schemas.openxmlformats.org/drawingml/2006/picture">
+                <pic:pic xmlns:pic="http://schemas.openxmlformats.org/drawingml/2006/picture">
+                  <pic:nvPicPr>
+                    <pic:cNvPr id="2072601762" name=""/>
+                    <pic:cNvPicPr/>
+                  </pic:nvPicPr>
+                  <pic:blipFill>
+                    <a:blip r:embed="rId7"/>
+                    <a:stretch>
+                      <a:fillRect/>
+                    </a:stretch>
+                  </pic:blipFill>
+                  <pic:spPr>
+                    <a:xfrm>
+                      <a:off x="0" y="0"/>
+                      <a:ext cx="5092962" cy="3848298"/>
+                    </a:xfrm>
+                    <a:prstGeom prst="rect">
+                      <a:avLst/>
+                    </a:prstGeom>
+                  </pic:spPr>
+                </pic:pic>
+              </a:graphicData>
+            </a:graphic>
+          </wp:inline>
+        </w:drawing>
+      </w:r>
+    </w:p>
+    <w:p>
+      <w:pPr>
+        <w:rPr>
+          <w:lang w:val="en-US"/>
+        </w:rPr>
+      </w:pPr>
     </w:p>
     <w:sectPr>
       <w:pgSz w:w="11906" w:h="16838"/>

</xml_diff>

<commit_message>
Ajout de screen de derniere simulation
</commit_message>
<xml_diff>
--- a/Compte Rendu_TP_IOT.docx
+++ b/Compte Rendu_TP_IOT.docx
@@ -102,27 +102,18 @@
           <w:lang w:val="en-US"/>
         </w:rPr>
       </w:pPr>
-      <w:proofErr w:type="spellStart"/>
-      <w:proofErr w:type="gramStart"/>
       <w:r>
         <w:rPr>
           <w:lang w:val="en-US"/>
         </w:rPr>
-        <w:t>Bargraphe</w:t>
-      </w:r>
-      <w:proofErr w:type="spellEnd"/>
+        <w:t xml:space="preserve">Bargraphe : </w:t>
+      </w:r>
       <w:r>
         <w:rPr>
           <w:lang w:val="en-US"/>
         </w:rPr>
-        <w:t xml:space="preserve"> :</w:t>
-      </w:r>
-      <w:proofErr w:type="gramEnd"/>
-      <w:r>
-        <w:rPr>
-          <w:lang w:val="en-US"/>
-        </w:rPr>
-        <w:t xml:space="preserve"> </w:t>
+        <w:br/>
+        <w:t xml:space="preserve">left to right led </w:t>
       </w:r>
     </w:p>
     <w:p>
@@ -221,11 +212,322 @@
       </w:r>
     </w:p>
     <w:p>
+      <w:r>
+        <w:t>Simulation 3 : capteur de temperature D</w:t>
+      </w:r>
+      <w:r>
+        <w:t>HT22</w:t>
+      </w:r>
+    </w:p>
+    <w:p>
+      <w:r>
+        <w:t>If temp&gt;20</w:t>
+      </w:r>
+    </w:p>
+    <w:p>
+      <w:r>
+        <w:lastRenderedPageBreak/>
+        <w:drawing>
+          <wp:inline distT="0" distB="0" distL="0" distR="0" wp14:anchorId="6A3F1B78" wp14:editId="509CA0FF">
+            <wp:extent cx="5760720" cy="3598545"/>
+            <wp:effectExtent l="0" t="0" r="0" b="1905"/>
+            <wp:docPr id="194350067" name="Image 1"/>
+            <wp:cNvGraphicFramePr>
+              <a:graphicFrameLocks xmlns:a="http://schemas.openxmlformats.org/drawingml/2006/main" noChangeAspect="1"/>
+            </wp:cNvGraphicFramePr>
+            <a:graphic xmlns:a="http://schemas.openxmlformats.org/drawingml/2006/main">
+              <a:graphicData uri="http://schemas.openxmlformats.org/drawingml/2006/picture">
+                <pic:pic xmlns:pic="http://schemas.openxmlformats.org/drawingml/2006/picture">
+                  <pic:nvPicPr>
+                    <pic:cNvPr id="194350067" name=""/>
+                    <pic:cNvPicPr/>
+                  </pic:nvPicPr>
+                  <pic:blipFill>
+                    <a:blip r:embed="rId8"/>
+                    <a:stretch>
+                      <a:fillRect/>
+                    </a:stretch>
+                  </pic:blipFill>
+                  <pic:spPr>
+                    <a:xfrm>
+                      <a:off x="0" y="0"/>
+                      <a:ext cx="5760720" cy="3598545"/>
+                    </a:xfrm>
+                    <a:prstGeom prst="rect">
+                      <a:avLst/>
+                    </a:prstGeom>
+                  </pic:spPr>
+                </pic:pic>
+              </a:graphicData>
+            </a:graphic>
+          </wp:inline>
+        </w:drawing>
+      </w:r>
+    </w:p>
+    <w:p>
+      <w:r>
+        <w:t xml:space="preserve">If temp &lt; 20 : </w:t>
+      </w:r>
+    </w:p>
+    <w:p>
+      <w:r>
+        <w:drawing>
+          <wp:inline distT="0" distB="0" distL="0" distR="0" wp14:anchorId="63943FE2" wp14:editId="757BCD2B">
+            <wp:extent cx="5760720" cy="3641725"/>
+            <wp:effectExtent l="0" t="0" r="0" b="0"/>
+            <wp:docPr id="1825652351" name="Image 1"/>
+            <wp:cNvGraphicFramePr>
+              <a:graphicFrameLocks xmlns:a="http://schemas.openxmlformats.org/drawingml/2006/main" noChangeAspect="1"/>
+            </wp:cNvGraphicFramePr>
+            <a:graphic xmlns:a="http://schemas.openxmlformats.org/drawingml/2006/main">
+              <a:graphicData uri="http://schemas.openxmlformats.org/drawingml/2006/picture">
+                <pic:pic xmlns:pic="http://schemas.openxmlformats.org/drawingml/2006/picture">
+                  <pic:nvPicPr>
+                    <pic:cNvPr id="1825652351" name=""/>
+                    <pic:cNvPicPr/>
+                  </pic:nvPicPr>
+                  <pic:blipFill>
+                    <a:blip r:embed="rId9"/>
+                    <a:stretch>
+                      <a:fillRect/>
+                    </a:stretch>
+                  </pic:blipFill>
+                  <pic:spPr>
+                    <a:xfrm>
+                      <a:off x="0" y="0"/>
+                      <a:ext cx="5760720" cy="3641725"/>
+                    </a:xfrm>
+                    <a:prstGeom prst="rect">
+                      <a:avLst/>
+                    </a:prstGeom>
+                  </pic:spPr>
+                </pic:pic>
+              </a:graphicData>
+            </a:graphic>
+          </wp:inline>
+        </w:drawing>
+      </w:r>
+    </w:p>
+    <w:p>
+      <w:r>
+        <w:t>Simulation 4 : LCD 16x2 I2C :</w:t>
+      </w:r>
+    </w:p>
+    <w:p>
+      <w:r>
+        <w:lastRenderedPageBreak/>
+        <w:drawing>
+          <wp:inline distT="0" distB="0" distL="0" distR="0" wp14:anchorId="2D68B9D7" wp14:editId="15A3BB30">
+            <wp:extent cx="5760720" cy="3325495"/>
+            <wp:effectExtent l="0" t="0" r="0" b="8255"/>
+            <wp:docPr id="663388502" name="Image 1"/>
+            <wp:cNvGraphicFramePr>
+              <a:graphicFrameLocks xmlns:a="http://schemas.openxmlformats.org/drawingml/2006/main" noChangeAspect="1"/>
+            </wp:cNvGraphicFramePr>
+            <a:graphic xmlns:a="http://schemas.openxmlformats.org/drawingml/2006/main">
+              <a:graphicData uri="http://schemas.openxmlformats.org/drawingml/2006/picture">
+                <pic:pic xmlns:pic="http://schemas.openxmlformats.org/drawingml/2006/picture">
+                  <pic:nvPicPr>
+                    <pic:cNvPr id="663388502" name=""/>
+                    <pic:cNvPicPr/>
+                  </pic:nvPicPr>
+                  <pic:blipFill>
+                    <a:blip r:embed="rId10"/>
+                    <a:stretch>
+                      <a:fillRect/>
+                    </a:stretch>
+                  </pic:blipFill>
+                  <pic:spPr>
+                    <a:xfrm>
+                      <a:off x="0" y="0"/>
+                      <a:ext cx="5760720" cy="3325495"/>
+                    </a:xfrm>
+                    <a:prstGeom prst="rect">
+                      <a:avLst/>
+                    </a:prstGeom>
+                  </pic:spPr>
+                </pic:pic>
+              </a:graphicData>
+            </a:graphic>
+          </wp:inline>
+        </w:drawing>
+      </w:r>
+    </w:p>
+    <w:p>
+      <w:r>
+        <w:t>Simulation LCD et DHT22 :</w:t>
+      </w:r>
+    </w:p>
+    <w:p>
       <w:pPr>
-        <w:rPr>
-          <w:lang w:val="en-US"/>
+        <w:jc w:val="both"/>
+        <w:rPr>
+          <w:rFonts w:ascii="Times New Roman" w:hAnsi="Times New Roman" w:cs="Times New Roman"/>
         </w:rPr>
       </w:pPr>
+      <w:r>
+        <w:drawing>
+          <wp:inline distT="0" distB="0" distL="0" distR="0" wp14:anchorId="1E4EAABD" wp14:editId="4AF8E9DA">
+            <wp:extent cx="5334274" cy="3264068"/>
+            <wp:effectExtent l="0" t="0" r="0" b="0"/>
+            <wp:docPr id="195395203" name="Image 1"/>
+            <wp:cNvGraphicFramePr>
+              <a:graphicFrameLocks xmlns:a="http://schemas.openxmlformats.org/drawingml/2006/main" noChangeAspect="1"/>
+            </wp:cNvGraphicFramePr>
+            <a:graphic xmlns:a="http://schemas.openxmlformats.org/drawingml/2006/main">
+              <a:graphicData uri="http://schemas.openxmlformats.org/drawingml/2006/picture">
+                <pic:pic xmlns:pic="http://schemas.openxmlformats.org/drawingml/2006/picture">
+                  <pic:nvPicPr>
+                    <pic:cNvPr id="195395203" name=""/>
+                    <pic:cNvPicPr/>
+                  </pic:nvPicPr>
+                  <pic:blipFill>
+                    <a:blip r:embed="rId11"/>
+                    <a:stretch>
+                      <a:fillRect/>
+                    </a:stretch>
+                  </pic:blipFill>
+                  <pic:spPr>
+                    <a:xfrm>
+                      <a:off x="0" y="0"/>
+                      <a:ext cx="5334274" cy="3264068"/>
+                    </a:xfrm>
+                    <a:prstGeom prst="rect">
+                      <a:avLst/>
+                    </a:prstGeom>
+                  </pic:spPr>
+                </pic:pic>
+              </a:graphicData>
+            </a:graphic>
+          </wp:inline>
+        </w:drawing>
+      </w:r>
+      <w:r>
+        <w:br/>
+      </w:r>
+      <w:r>
+        <w:rPr>
+          <w:rFonts w:ascii="Times New Roman" w:hAnsi="Times New Roman" w:cs="Times New Roman"/>
+        </w:rPr>
+        <w:t xml:space="preserve">Les LED utilisent des sorties </w:t>
+      </w:r>
+      <w:r>
+        <w:rPr>
+          <w:rFonts w:ascii="Times New Roman" w:hAnsi="Times New Roman" w:cs="Times New Roman"/>
+          <w:b/>
+          <w:bCs/>
+        </w:rPr>
+        <w:t>numériques</w:t>
+      </w:r>
+      <w:r>
+        <w:rPr>
+          <w:rFonts w:ascii="Times New Roman" w:hAnsi="Times New Roman" w:cs="Times New Roman"/>
+        </w:rPr>
+        <w:t xml:space="preserve"> (HIGH/LOW). Le DHT22 envoie aussi un signal numérique, et peut donc se brancher sur une broche analogique comme A0, qui sert alors d’E/S numérique. L’afficheur LCD passe par le bus </w:t>
+      </w:r>
+      <w:r>
+        <w:rPr>
+          <w:rFonts w:ascii="Times New Roman" w:hAnsi="Times New Roman" w:cs="Times New Roman"/>
+          <w:b/>
+          <w:bCs/>
+        </w:rPr>
+        <w:t>I2C</w:t>
+      </w:r>
+      <w:r>
+        <w:rPr>
+          <w:rFonts w:ascii="Times New Roman" w:hAnsi="Times New Roman" w:cs="Times New Roman"/>
+        </w:rPr>
+        <w:t xml:space="preserve"> sur A4/A5 : 2 fils seulement, et chaque composant y est identifié par son adresse. On choisit donc la broche selon le type de signal ou de protocole, pas selon son nom.</w:t>
+      </w:r>
+    </w:p>
+    <w:p>
+      <w:pPr>
+        <w:jc w:val="both"/>
+        <w:rPr>
+          <w:rFonts w:ascii="Times New Roman" w:hAnsi="Times New Roman" w:cs="Times New Roman"/>
+        </w:rPr>
+      </w:pPr>
+      <w:r>
+        <w:rPr>
+          <w:rFonts w:ascii="Times New Roman" w:hAnsi="Times New Roman" w:cs="Times New Roman"/>
+        </w:rPr>
+        <w:t xml:space="preserve">Et </w:t>
+      </w:r>
+      <w:r>
+        <w:rPr>
+          <w:rFonts w:ascii="Times New Roman" w:hAnsi="Times New Roman" w:cs="Times New Roman"/>
+        </w:rPr>
+        <w:t>c</w:t>
+      </w:r>
+      <w:r>
+        <w:rPr>
+          <w:rFonts w:ascii="Times New Roman" w:hAnsi="Times New Roman" w:cs="Times New Roman"/>
+        </w:rPr>
+        <w:t xml:space="preserve">haque circuit précédent a validé un seul élément (LED, capteur, afficheur). Ici, on </w:t>
+      </w:r>
+      <w:r>
+        <w:rPr>
+          <w:rFonts w:ascii="Times New Roman" w:hAnsi="Times New Roman" w:cs="Times New Roman"/>
+          <w:b/>
+          <w:bCs/>
+        </w:rPr>
+        <w:t>assemble des briques déjà testées</w:t>
+      </w:r>
+      <w:r>
+        <w:rPr>
+          <w:rFonts w:ascii="Times New Roman" w:hAnsi="Times New Roman" w:cs="Times New Roman"/>
+        </w:rPr>
+        <w:t>, ce qui facilite la recherche d’erreurs.</w:t>
+      </w:r>
+    </w:p>
+    <w:p>
+      <w:pPr>
+        <w:jc w:val="both"/>
+        <w:rPr>
+          <w:rFonts w:ascii="Times New Roman" w:hAnsi="Times New Roman" w:cs="Times New Roman"/>
+        </w:rPr>
+      </w:pPr>
+      <w:r>
+        <w:rPr>
+          <w:rFonts w:ascii="Times New Roman" w:hAnsi="Times New Roman" w:cs="Times New Roman"/>
+        </w:rPr>
+        <w:lastRenderedPageBreak/>
+        <w:drawing>
+          <wp:inline distT="0" distB="0" distL="0" distR="0" wp14:anchorId="743FEE8F" wp14:editId="6993119F">
+            <wp:extent cx="5760720" cy="2963545"/>
+            <wp:effectExtent l="0" t="0" r="0" b="8255"/>
+            <wp:docPr id="312292923" name="Image 1"/>
+            <wp:cNvGraphicFramePr>
+              <a:graphicFrameLocks xmlns:a="http://schemas.openxmlformats.org/drawingml/2006/main" noChangeAspect="1"/>
+            </wp:cNvGraphicFramePr>
+            <a:graphic xmlns:a="http://schemas.openxmlformats.org/drawingml/2006/main">
+              <a:graphicData uri="http://schemas.openxmlformats.org/drawingml/2006/picture">
+                <pic:pic xmlns:pic="http://schemas.openxmlformats.org/drawingml/2006/picture">
+                  <pic:nvPicPr>
+                    <pic:cNvPr id="312292923" name=""/>
+                    <pic:cNvPicPr/>
+                  </pic:nvPicPr>
+                  <pic:blipFill>
+                    <a:blip r:embed="rId12"/>
+                    <a:stretch>
+                      <a:fillRect/>
+                    </a:stretch>
+                  </pic:blipFill>
+                  <pic:spPr>
+                    <a:xfrm>
+                      <a:off x="0" y="0"/>
+                      <a:ext cx="5760720" cy="2963545"/>
+                    </a:xfrm>
+                    <a:prstGeom prst="rect">
+                      <a:avLst/>
+                    </a:prstGeom>
+                  </pic:spPr>
+                </pic:pic>
+              </a:graphicData>
+            </a:graphic>
+          </wp:inline>
+        </w:drawing>
+      </w:r>
     </w:p>
     <w:sectPr>
       <w:pgSz w:w="11906" w:h="16838"/>
@@ -840,7 +1142,6 @@
   <w:style w:type="character" w:default="1" w:styleId="Policepardfaut">
     <w:name w:val="Default Paragraph Font"/>
     <w:uiPriority w:val="1"/>
-    <w:semiHidden/>
     <w:unhideWhenUsed/>
   </w:style>
   <w:style w:type="table" w:default="1" w:styleId="TableauNormal">

</xml_diff>

<commit_message>
la souscription des paramètres sous MQTT
</commit_message>
<xml_diff>
--- a/Compte Rendu_TP_IOT.docx
+++ b/Compte Rendu_TP_IOT.docx
@@ -517,6 +517,358 @@
                     <a:xfrm>
                       <a:off x="0" y="0"/>
                       <a:ext cx="5760720" cy="2963545"/>
+                    </a:xfrm>
+                    <a:prstGeom prst="rect">
+                      <a:avLst/>
+                    </a:prstGeom>
+                  </pic:spPr>
+                </pic:pic>
+              </a:graphicData>
+            </a:graphic>
+          </wp:inline>
+        </w:drawing>
+      </w:r>
+    </w:p>
+    <w:p>
+      <w:pPr>
+        <w:jc w:val="both"/>
+        <w:rPr>
+          <w:rFonts w:ascii="Times New Roman" w:hAnsi="Times New Roman" w:cs="Times New Roman"/>
+        </w:rPr>
+      </w:pPr>
+      <w:r>
+        <w:rPr>
+          <w:rFonts w:ascii="Times New Roman" w:hAnsi="Times New Roman" w:cs="Times New Roman"/>
+        </w:rPr>
+        <w:t>Le 2</w:t>
+      </w:r>
+      <w:r>
+        <w:rPr>
+          <w:rFonts w:ascii="Times New Roman" w:hAnsi="Times New Roman" w:cs="Times New Roman"/>
+          <w:vertAlign w:val="superscript"/>
+        </w:rPr>
+        <w:t>ème</w:t>
+      </w:r>
+      <w:r>
+        <w:rPr>
+          <w:rFonts w:ascii="Times New Roman" w:hAnsi="Times New Roman" w:cs="Times New Roman"/>
+        </w:rPr>
+        <w:t xml:space="preserve"> TP : </w:t>
+      </w:r>
+    </w:p>
+    <w:p>
+      <w:pPr>
+        <w:jc w:val="both"/>
+        <w:rPr>
+          <w:rFonts w:ascii="Times New Roman" w:hAnsi="Times New Roman" w:cs="Times New Roman"/>
+        </w:rPr>
+      </w:pPr>
+      <w:r>
+        <w:rPr>
+          <w:rFonts w:ascii="Times New Roman" w:hAnsi="Times New Roman" w:cs="Times New Roman"/>
+        </w:rPr>
+        <w:drawing>
+          <wp:inline distT="0" distB="0" distL="0" distR="0" wp14:anchorId="6A8F3D13" wp14:editId="7BB1AAE7">
+            <wp:extent cx="5760720" cy="2987675"/>
+            <wp:effectExtent l="0" t="0" r="0" b="3175"/>
+            <wp:docPr id="672508107" name="Image 1"/>
+            <wp:cNvGraphicFramePr>
+              <a:graphicFrameLocks xmlns:a="http://schemas.openxmlformats.org/drawingml/2006/main" noChangeAspect="1"/>
+            </wp:cNvGraphicFramePr>
+            <a:graphic xmlns:a="http://schemas.openxmlformats.org/drawingml/2006/main">
+              <a:graphicData uri="http://schemas.openxmlformats.org/drawingml/2006/picture">
+                <pic:pic xmlns:pic="http://schemas.openxmlformats.org/drawingml/2006/picture">
+                  <pic:nvPicPr>
+                    <pic:cNvPr id="672508107" name=""/>
+                    <pic:cNvPicPr/>
+                  </pic:nvPicPr>
+                  <pic:blipFill>
+                    <a:blip r:embed="rId13"/>
+                    <a:stretch>
+                      <a:fillRect/>
+                    </a:stretch>
+                  </pic:blipFill>
+                  <pic:spPr>
+                    <a:xfrm>
+                      <a:off x="0" y="0"/>
+                      <a:ext cx="5760720" cy="2987675"/>
+                    </a:xfrm>
+                    <a:prstGeom prst="rect">
+                      <a:avLst/>
+                    </a:prstGeom>
+                  </pic:spPr>
+                </pic:pic>
+              </a:graphicData>
+            </a:graphic>
+          </wp:inline>
+        </w:drawing>
+      </w:r>
+    </w:p>
+    <w:p>
+      <w:pPr>
+        <w:jc w:val="both"/>
+        <w:rPr>
+          <w:rFonts w:ascii="Times New Roman" w:hAnsi="Times New Roman" w:cs="Times New Roman"/>
+        </w:rPr>
+      </w:pPr>
+      <w:r>
+        <w:rPr>
+          <w:rFonts w:ascii="Times New Roman" w:hAnsi="Times New Roman" w:cs="Times New Roman"/>
+        </w:rPr>
+        <w:t>le message arrive immédiatement à l'abonnement, alors qu'il a été publié avant. Sans Retain, un nouvel abonné ne reçoit rien tant que personne ne republie.</w:t>
+      </w:r>
+    </w:p>
+    <w:p>
+      <w:pPr>
+        <w:jc w:val="both"/>
+        <w:rPr>
+          <w:rFonts w:ascii="Times New Roman" w:hAnsi="Times New Roman" w:cs="Times New Roman"/>
+        </w:rPr>
+      </w:pPr>
+      <w:r>
+        <w:rPr>
+          <w:rFonts w:ascii="Times New Roman" w:hAnsi="Times New Roman" w:cs="Times New Roman"/>
+        </w:rPr>
+        <w:t>le broker garde en mémoire le dernier message retenu du topic et l'envoie à chaque nouvel abonné. C'est utile pour un capteur : un nouvel abonné connaît tout de suite la dernière température. Pour l'effacer, publie un message vide avec Retain coché.</w:t>
+      </w:r>
+    </w:p>
+    <w:p>
+      <w:pPr>
+        <w:jc w:val="both"/>
+        <w:rPr>
+          <w:rFonts w:ascii="Times New Roman" w:hAnsi="Times New Roman" w:cs="Times New Roman"/>
+        </w:rPr>
+      </w:pPr>
+      <w:r>
+        <w:rPr>
+          <w:rFonts w:ascii="Times New Roman" w:hAnsi="Times New Roman" w:cs="Times New Roman"/>
+        </w:rPr>
+        <w:t xml:space="preserve">Partie 6.1.3 : </w:t>
+      </w:r>
+      <w:r>
+        <w:rPr>
+          <w:rFonts w:ascii="Times New Roman" w:hAnsi="Times New Roman" w:cs="Times New Roman"/>
+        </w:rPr>
+        <w:t>WiFi + synchro NTP + affichage LCD</w:t>
+      </w:r>
+    </w:p>
+    <w:p>
+      <w:pPr>
+        <w:rPr>
+          <w:rFonts w:ascii="Times New Roman" w:hAnsi="Times New Roman" w:cs="Times New Roman"/>
+        </w:rPr>
+      </w:pPr>
+      <w:r>
+        <w:rPr>
+          <w:rFonts w:ascii="Times New Roman" w:hAnsi="Times New Roman" w:cs="Times New Roman"/>
+        </w:rPr>
+        <w:t>avec "IoT IMT Nord Europe 5G" (ou le reseau 5 GHz) la connexion ECHOUE.</w:t>
+      </w:r>
+      <w:r>
+        <w:rPr>
+          <w:rFonts w:ascii="Times New Roman" w:hAnsi="Times New Roman" w:cs="Times New Roman"/>
+        </w:rPr>
+        <w:t xml:space="preserve"> </w:t>
+      </w:r>
+      <w:r>
+        <w:rPr>
+          <w:rFonts w:ascii="Times New Roman" w:hAnsi="Times New Roman" w:cs="Times New Roman"/>
+        </w:rPr>
+        <w:t>Le module WiFi de l'UNO R4 (ESP32-S3) ne gere que la bande 2,4 GHz :</w:t>
+      </w:r>
+      <w:r>
+        <w:rPr>
+          <w:rFonts w:ascii="Times New Roman" w:hAnsi="Times New Roman" w:cs="Times New Roman"/>
+        </w:rPr>
+        <w:t xml:space="preserve"> </w:t>
+      </w:r>
+      <w:r>
+        <w:rPr>
+          <w:rFonts w:ascii="Times New Roman" w:hAnsi="Times New Roman" w:cs="Times New Roman"/>
+        </w:rPr>
+        <w:t>il ne voit pas du tout les reseaux 5 GHz, donc setup_wifi() renvoie false ("Pas de WiFi" sur le LCD).</w:t>
+      </w:r>
+    </w:p>
+    <w:p>
+      <w:pPr>
+        <w:rPr>
+          <w:rFonts w:ascii="Times New Roman" w:hAnsi="Times New Roman" w:cs="Times New Roman"/>
+        </w:rPr>
+      </w:pPr>
+      <w:r>
+        <w:rPr>
+          <w:rFonts w:ascii="Times New Roman" w:hAnsi="Times New Roman" w:cs="Times New Roman"/>
+        </w:rPr>
+        <w:lastRenderedPageBreak/>
+        <w:drawing>
+          <wp:inline distT="0" distB="0" distL="0" distR="0" wp14:anchorId="613BD950" wp14:editId="45AF7C99">
+            <wp:extent cx="5760720" cy="2794000"/>
+            <wp:effectExtent l="0" t="0" r="0" b="6350"/>
+            <wp:docPr id="599785131" name="Image 1"/>
+            <wp:cNvGraphicFramePr>
+              <a:graphicFrameLocks xmlns:a="http://schemas.openxmlformats.org/drawingml/2006/main" noChangeAspect="1"/>
+            </wp:cNvGraphicFramePr>
+            <a:graphic xmlns:a="http://schemas.openxmlformats.org/drawingml/2006/main">
+              <a:graphicData uri="http://schemas.openxmlformats.org/drawingml/2006/picture">
+                <pic:pic xmlns:pic="http://schemas.openxmlformats.org/drawingml/2006/picture">
+                  <pic:nvPicPr>
+                    <pic:cNvPr id="599785131" name=""/>
+                    <pic:cNvPicPr/>
+                  </pic:nvPicPr>
+                  <pic:blipFill>
+                    <a:blip r:embed="rId14"/>
+                    <a:stretch>
+                      <a:fillRect/>
+                    </a:stretch>
+                  </pic:blipFill>
+                  <pic:spPr>
+                    <a:xfrm>
+                      <a:off x="0" y="0"/>
+                      <a:ext cx="5760720" cy="2794000"/>
+                    </a:xfrm>
+                    <a:prstGeom prst="rect">
+                      <a:avLst/>
+                    </a:prstGeom>
+                  </pic:spPr>
+                </pic:pic>
+              </a:graphicData>
+            </a:graphic>
+          </wp:inline>
+        </w:drawing>
+      </w:r>
+    </w:p>
+    <w:p>
+      <w:pPr>
+        <w:rPr>
+          <w:rFonts w:ascii="Times New Roman" w:hAnsi="Times New Roman" w:cs="Times New Roman"/>
+        </w:rPr>
+      </w:pPr>
+      <w:r>
+        <w:rPr>
+          <w:rFonts w:ascii="Times New Roman" w:hAnsi="Times New Roman" w:cs="Times New Roman"/>
+        </w:rPr>
+        <w:drawing>
+          <wp:inline distT="0" distB="0" distL="0" distR="0" wp14:anchorId="00F7F864" wp14:editId="36427BBF">
+            <wp:extent cx="5760720" cy="3103245"/>
+            <wp:effectExtent l="0" t="0" r="0" b="1905"/>
+            <wp:docPr id="244252625" name="Image 1"/>
+            <wp:cNvGraphicFramePr>
+              <a:graphicFrameLocks xmlns:a="http://schemas.openxmlformats.org/drawingml/2006/main" noChangeAspect="1"/>
+            </wp:cNvGraphicFramePr>
+            <a:graphic xmlns:a="http://schemas.openxmlformats.org/drawingml/2006/main">
+              <a:graphicData uri="http://schemas.openxmlformats.org/drawingml/2006/picture">
+                <pic:pic xmlns:pic="http://schemas.openxmlformats.org/drawingml/2006/picture">
+                  <pic:nvPicPr>
+                    <pic:cNvPr id="244252625" name=""/>
+                    <pic:cNvPicPr/>
+                  </pic:nvPicPr>
+                  <pic:blipFill>
+                    <a:blip r:embed="rId15"/>
+                    <a:stretch>
+                      <a:fillRect/>
+                    </a:stretch>
+                  </pic:blipFill>
+                  <pic:spPr>
+                    <a:xfrm>
+                      <a:off x="0" y="0"/>
+                      <a:ext cx="5760720" cy="3103245"/>
+                    </a:xfrm>
+                    <a:prstGeom prst="rect">
+                      <a:avLst/>
+                    </a:prstGeom>
+                  </pic:spPr>
+                </pic:pic>
+              </a:graphicData>
+            </a:graphic>
+          </wp:inline>
+        </w:drawing>
+      </w:r>
+    </w:p>
+    <w:p>
+      <w:pPr>
+        <w:jc w:val="both"/>
+        <w:rPr>
+          <w:rFonts w:ascii="Times New Roman" w:hAnsi="Times New Roman" w:cs="Times New Roman"/>
+        </w:rPr>
+      </w:pPr>
+      <w:r>
+        <w:rPr>
+          <w:rFonts w:ascii="Times New Roman" w:hAnsi="Times New Roman" w:cs="Times New Roman"/>
+        </w:rPr>
+        <w:lastRenderedPageBreak/>
+        <w:drawing>
+          <wp:inline distT="0" distB="0" distL="0" distR="0" wp14:anchorId="0DE8692A" wp14:editId="7EF4EA55">
+            <wp:extent cx="5760720" cy="2964815"/>
+            <wp:effectExtent l="0" t="0" r="0" b="6985"/>
+            <wp:docPr id="56468412" name="Image 1"/>
+            <wp:cNvGraphicFramePr>
+              <a:graphicFrameLocks xmlns:a="http://schemas.openxmlformats.org/drawingml/2006/main" noChangeAspect="1"/>
+            </wp:cNvGraphicFramePr>
+            <a:graphic xmlns:a="http://schemas.openxmlformats.org/drawingml/2006/main">
+              <a:graphicData uri="http://schemas.openxmlformats.org/drawingml/2006/picture">
+                <pic:pic xmlns:pic="http://schemas.openxmlformats.org/drawingml/2006/picture">
+                  <pic:nvPicPr>
+                    <pic:cNvPr id="56468412" name=""/>
+                    <pic:cNvPicPr/>
+                  </pic:nvPicPr>
+                  <pic:blipFill>
+                    <a:blip r:embed="rId16"/>
+                    <a:stretch>
+                      <a:fillRect/>
+                    </a:stretch>
+                  </pic:blipFill>
+                  <pic:spPr>
+                    <a:xfrm>
+                      <a:off x="0" y="0"/>
+                      <a:ext cx="5760720" cy="2964815"/>
+                    </a:xfrm>
+                    <a:prstGeom prst="rect">
+                      <a:avLst/>
+                    </a:prstGeom>
+                  </pic:spPr>
+                </pic:pic>
+              </a:graphicData>
+            </a:graphic>
+          </wp:inline>
+        </w:drawing>
+      </w:r>
+    </w:p>
+    <w:p>
+      <w:pPr>
+        <w:jc w:val="both"/>
+        <w:rPr>
+          <w:rFonts w:ascii="Times New Roman" w:hAnsi="Times New Roman" w:cs="Times New Roman"/>
+        </w:rPr>
+      </w:pPr>
+      <w:r>
+        <w:rPr>
+          <w:rFonts w:ascii="Times New Roman" w:hAnsi="Times New Roman" w:cs="Times New Roman"/>
+        </w:rPr>
+        <w:drawing>
+          <wp:inline distT="0" distB="0" distL="0" distR="0" wp14:anchorId="422A8F4D" wp14:editId="72F3138E">
+            <wp:extent cx="5760720" cy="2986405"/>
+            <wp:effectExtent l="0" t="0" r="0" b="4445"/>
+            <wp:docPr id="1493752492" name="Image 1"/>
+            <wp:cNvGraphicFramePr>
+              <a:graphicFrameLocks xmlns:a="http://schemas.openxmlformats.org/drawingml/2006/main" noChangeAspect="1"/>
+            </wp:cNvGraphicFramePr>
+            <a:graphic xmlns:a="http://schemas.openxmlformats.org/drawingml/2006/main">
+              <a:graphicData uri="http://schemas.openxmlformats.org/drawingml/2006/picture">
+                <pic:pic xmlns:pic="http://schemas.openxmlformats.org/drawingml/2006/picture">
+                  <pic:nvPicPr>
+                    <pic:cNvPr id="1493752492" name=""/>
+                    <pic:cNvPicPr/>
+                  </pic:nvPicPr>
+                  <pic:blipFill>
+                    <a:blip r:embed="rId17"/>
+                    <a:stretch>
+                      <a:fillRect/>
+                    </a:stretch>
+                  </pic:blipFill>
+                  <pic:spPr>
+                    <a:xfrm>
+                      <a:off x="0" y="0"/>
+                      <a:ext cx="5760720" cy="2986405"/>
                     </a:xfrm>
                     <a:prstGeom prst="rect">
                       <a:avLst/>

</xml_diff>

<commit_message>
l'amelioration de la communication sous MQTT
</commit_message>
<xml_diff>
--- a/Compte Rendu_TP_IOT.docx
+++ b/Compte Rendu_TP_IOT.docx
@@ -28,7 +28,7 @@
                     <pic:cNvPicPr/>
                   </pic:nvPicPr>
                   <pic:blipFill>
-                    <a:blip r:embed="rId4"/>
+                    <a:blip r:embed="rId5"/>
                     <a:stretch>
                       <a:fillRect/>
                     </a:stretch>
@@ -75,7 +75,7 @@
                     <pic:cNvPicPr/>
                   </pic:nvPicPr>
                   <pic:blipFill>
-                    <a:blip r:embed="rId5"/>
+                    <a:blip r:embed="rId6"/>
                     <a:stretch>
                       <a:fillRect/>
                     </a:stretch>
@@ -102,11 +102,27 @@
           <w:lang w:val="en-US"/>
         </w:rPr>
       </w:pPr>
+      <w:proofErr w:type="spellStart"/>
+      <w:proofErr w:type="gramStart"/>
       <w:r>
         <w:rPr>
           <w:lang w:val="en-US"/>
         </w:rPr>
-        <w:t xml:space="preserve">Bargraphe : </w:t>
+        <w:t>Bargraphe</w:t>
+      </w:r>
+      <w:proofErr w:type="spellEnd"/>
+      <w:r>
+        <w:rPr>
+          <w:lang w:val="en-US"/>
+        </w:rPr>
+        <w:t xml:space="preserve"> :</w:t>
+      </w:r>
+      <w:proofErr w:type="gramEnd"/>
+      <w:r>
+        <w:rPr>
+          <w:lang w:val="en-US"/>
+        </w:rPr>
+        <w:t xml:space="preserve"> </w:t>
       </w:r>
       <w:r>
         <w:rPr>
@@ -143,7 +159,7 @@
                     <pic:cNvPicPr/>
                   </pic:nvPicPr>
                   <pic:blipFill>
-                    <a:blip r:embed="rId6"/>
+                    <a:blip r:embed="rId7"/>
                     <a:stretch>
                       <a:fillRect/>
                     </a:stretch>
@@ -190,7 +206,7 @@
                     <pic:cNvPicPr/>
                   </pic:nvPicPr>
                   <pic:blipFill>
-                    <a:blip r:embed="rId7"/>
+                    <a:blip r:embed="rId8"/>
                     <a:stretch>
                       <a:fillRect/>
                     </a:stretch>
@@ -213,7 +229,15 @@
     </w:p>
     <w:p>
       <w:r>
-        <w:t>Simulation 3 : capteur de temperature D</w:t>
+        <w:t xml:space="preserve">Simulation 3 : capteur de </w:t>
+      </w:r>
+      <w:proofErr w:type="spellStart"/>
+      <w:r>
+        <w:t>temperature</w:t>
+      </w:r>
+      <w:proofErr w:type="spellEnd"/>
+      <w:r>
+        <w:t xml:space="preserve"> D</w:t>
       </w:r>
       <w:r>
         <w:t>HT22</w:t>
@@ -243,7 +267,7 @@
                     <pic:cNvPicPr/>
                   </pic:nvPicPr>
                   <pic:blipFill>
-                    <a:blip r:embed="rId8"/>
+                    <a:blip r:embed="rId9"/>
                     <a:stretch>
                       <a:fillRect/>
                     </a:stretch>
@@ -287,7 +311,7 @@
                     <pic:cNvPicPr/>
                   </pic:nvPicPr>
                   <pic:blipFill>
-                    <a:blip r:embed="rId9"/>
+                    <a:blip r:embed="rId10"/>
                     <a:stretch>
                       <a:fillRect/>
                     </a:stretch>
@@ -332,7 +356,7 @@
                     <pic:cNvPicPr/>
                   </pic:nvPicPr>
                   <pic:blipFill>
-                    <a:blip r:embed="rId10"/>
+                    <a:blip r:embed="rId11"/>
                     <a:stretch>
                       <a:fillRect/>
                     </a:stretch>
@@ -382,7 +406,7 @@
                     <pic:cNvPicPr/>
                   </pic:nvPicPr>
                   <pic:blipFill>
-                    <a:blip r:embed="rId11"/>
+                    <a:blip r:embed="rId12"/>
                     <a:stretch>
                       <a:fillRect/>
                     </a:stretch>
@@ -508,7 +532,7 @@
                     <pic:cNvPicPr/>
                   </pic:nvPicPr>
                   <pic:blipFill>
-                    <a:blip r:embed="rId12"/>
+                    <a:blip r:embed="rId13"/>
                     <a:stretch>
                       <a:fillRect/>
                     </a:stretch>
@@ -583,7 +607,7 @@
                     <pic:cNvPicPr/>
                   </pic:nvPicPr>
                   <pic:blipFill>
-                    <a:blip r:embed="rId13"/>
+                    <a:blip r:embed="rId14"/>
                     <a:stretch>
                       <a:fillRect/>
                     </a:stretch>
@@ -611,11 +635,33 @@
           <w:rFonts w:ascii="Times New Roman" w:hAnsi="Times New Roman" w:cs="Times New Roman"/>
         </w:rPr>
       </w:pPr>
-      <w:r>
-        <w:rPr>
-          <w:rFonts w:ascii="Times New Roman" w:hAnsi="Times New Roman" w:cs="Times New Roman"/>
-        </w:rPr>
-        <w:t>le message arrive immédiatement à l'abonnement, alors qu'il a été publié avant. Sans Retain, un nouvel abonné ne reçoit rien tant que personne ne republie.</w:t>
+      <w:proofErr w:type="gramStart"/>
+      <w:r>
+        <w:rPr>
+          <w:rFonts w:ascii="Times New Roman" w:hAnsi="Times New Roman" w:cs="Times New Roman"/>
+        </w:rPr>
+        <w:t>le</w:t>
+      </w:r>
+      <w:proofErr w:type="gramEnd"/>
+      <w:r>
+        <w:rPr>
+          <w:rFonts w:ascii="Times New Roman" w:hAnsi="Times New Roman" w:cs="Times New Roman"/>
+        </w:rPr>
+        <w:t xml:space="preserve"> message arrive immédiatement à l'abonnement, alors qu'il a été publié avant. Sans </w:t>
+      </w:r>
+      <w:proofErr w:type="spellStart"/>
+      <w:r>
+        <w:rPr>
+          <w:rFonts w:ascii="Times New Roman" w:hAnsi="Times New Roman" w:cs="Times New Roman"/>
+        </w:rPr>
+        <w:t>Retain</w:t>
+      </w:r>
+      <w:proofErr w:type="spellEnd"/>
+      <w:r>
+        <w:rPr>
+          <w:rFonts w:ascii="Times New Roman" w:hAnsi="Times New Roman" w:cs="Times New Roman"/>
+        </w:rPr>
+        <w:t>, un nouvel abonné ne reçoit rien tant que personne ne republie.</w:t>
       </w:r>
     </w:p>
     <w:p>
@@ -625,11 +671,33 @@
           <w:rFonts w:ascii="Times New Roman" w:hAnsi="Times New Roman" w:cs="Times New Roman"/>
         </w:rPr>
       </w:pPr>
-      <w:r>
-        <w:rPr>
-          <w:rFonts w:ascii="Times New Roman" w:hAnsi="Times New Roman" w:cs="Times New Roman"/>
-        </w:rPr>
-        <w:t>le broker garde en mémoire le dernier message retenu du topic et l'envoie à chaque nouvel abonné. C'est utile pour un capteur : un nouvel abonné connaît tout de suite la dernière température. Pour l'effacer, publie un message vide avec Retain coché.</w:t>
+      <w:proofErr w:type="gramStart"/>
+      <w:r>
+        <w:rPr>
+          <w:rFonts w:ascii="Times New Roman" w:hAnsi="Times New Roman" w:cs="Times New Roman"/>
+        </w:rPr>
+        <w:t>le</w:t>
+      </w:r>
+      <w:proofErr w:type="gramEnd"/>
+      <w:r>
+        <w:rPr>
+          <w:rFonts w:ascii="Times New Roman" w:hAnsi="Times New Roman" w:cs="Times New Roman"/>
+        </w:rPr>
+        <w:t xml:space="preserve"> broker garde en mémoire le dernier message retenu du topic et l'envoie à chaque nouvel abonné. C'est utile pour un capteur : un nouvel abonné connaît tout de suite la dernière température. Pour l'effacer, publie un message vide avec </w:t>
+      </w:r>
+      <w:proofErr w:type="spellStart"/>
+      <w:r>
+        <w:rPr>
+          <w:rFonts w:ascii="Times New Roman" w:hAnsi="Times New Roman" w:cs="Times New Roman"/>
+        </w:rPr>
+        <w:t>Retain</w:t>
+      </w:r>
+      <w:proofErr w:type="spellEnd"/>
+      <w:r>
+        <w:rPr>
+          <w:rFonts w:ascii="Times New Roman" w:hAnsi="Times New Roman" w:cs="Times New Roman"/>
+        </w:rPr>
+        <w:t xml:space="preserve"> coché.</w:t>
       </w:r>
     </w:p>
     <w:p>
@@ -645,24 +713,54 @@
         </w:rPr>
         <w:t xml:space="preserve">Partie 6.1.3 : </w:t>
       </w:r>
-      <w:r>
-        <w:rPr>
-          <w:rFonts w:ascii="Times New Roman" w:hAnsi="Times New Roman" w:cs="Times New Roman"/>
-        </w:rPr>
-        <w:t>WiFi + synchro NTP + affichage LCD</w:t>
-      </w:r>
-    </w:p>
-    <w:p>
-      <w:pPr>
-        <w:rPr>
-          <w:rFonts w:ascii="Times New Roman" w:hAnsi="Times New Roman" w:cs="Times New Roman"/>
-        </w:rPr>
-      </w:pPr>
-      <w:r>
-        <w:rPr>
-          <w:rFonts w:ascii="Times New Roman" w:hAnsi="Times New Roman" w:cs="Times New Roman"/>
-        </w:rPr>
-        <w:t>avec "IoT IMT Nord Europe 5G" (ou le reseau 5 GHz) la connexion ECHOUE.</w:t>
+      <w:proofErr w:type="spellStart"/>
+      <w:r>
+        <w:rPr>
+          <w:rFonts w:ascii="Times New Roman" w:hAnsi="Times New Roman" w:cs="Times New Roman"/>
+        </w:rPr>
+        <w:t>WiFi</w:t>
+      </w:r>
+      <w:proofErr w:type="spellEnd"/>
+      <w:r>
+        <w:rPr>
+          <w:rFonts w:ascii="Times New Roman" w:hAnsi="Times New Roman" w:cs="Times New Roman"/>
+        </w:rPr>
+        <w:t xml:space="preserve"> + synchro NTP + affichage LCD</w:t>
+      </w:r>
+    </w:p>
+    <w:p>
+      <w:pPr>
+        <w:rPr>
+          <w:rFonts w:ascii="Times New Roman" w:hAnsi="Times New Roman" w:cs="Times New Roman"/>
+        </w:rPr>
+      </w:pPr>
+      <w:proofErr w:type="gramStart"/>
+      <w:r>
+        <w:rPr>
+          <w:rFonts w:ascii="Times New Roman" w:hAnsi="Times New Roman" w:cs="Times New Roman"/>
+        </w:rPr>
+        <w:t>avec</w:t>
+      </w:r>
+      <w:proofErr w:type="gramEnd"/>
+      <w:r>
+        <w:rPr>
+          <w:rFonts w:ascii="Times New Roman" w:hAnsi="Times New Roman" w:cs="Times New Roman"/>
+        </w:rPr>
+        <w:t xml:space="preserve"> "IoT IMT Nord Europe 5G" (ou le </w:t>
+      </w:r>
+      <w:proofErr w:type="spellStart"/>
+      <w:r>
+        <w:rPr>
+          <w:rFonts w:ascii="Times New Roman" w:hAnsi="Times New Roman" w:cs="Times New Roman"/>
+        </w:rPr>
+        <w:t>reseau</w:t>
+      </w:r>
+      <w:proofErr w:type="spellEnd"/>
+      <w:r>
+        <w:rPr>
+          <w:rFonts w:ascii="Times New Roman" w:hAnsi="Times New Roman" w:cs="Times New Roman"/>
+        </w:rPr>
+        <w:t xml:space="preserve"> 5 GHz) la connexion ECHOUE.</w:t>
       </w:r>
       <w:r>
         <w:rPr>
@@ -674,7 +772,35 @@
         <w:rPr>
           <w:rFonts w:ascii="Times New Roman" w:hAnsi="Times New Roman" w:cs="Times New Roman"/>
         </w:rPr>
-        <w:t>Le module WiFi de l'UNO R4 (ESP32-S3) ne gere que la bande 2,4 GHz :</w:t>
+        <w:t xml:space="preserve">Le module </w:t>
+      </w:r>
+      <w:proofErr w:type="spellStart"/>
+      <w:r>
+        <w:rPr>
+          <w:rFonts w:ascii="Times New Roman" w:hAnsi="Times New Roman" w:cs="Times New Roman"/>
+        </w:rPr>
+        <w:t>WiFi</w:t>
+      </w:r>
+      <w:proofErr w:type="spellEnd"/>
+      <w:r>
+        <w:rPr>
+          <w:rFonts w:ascii="Times New Roman" w:hAnsi="Times New Roman" w:cs="Times New Roman"/>
+        </w:rPr>
+        <w:t xml:space="preserve"> de l'UNO R4 (ESP32-S3) ne </w:t>
+      </w:r>
+      <w:proofErr w:type="spellStart"/>
+      <w:r>
+        <w:rPr>
+          <w:rFonts w:ascii="Times New Roman" w:hAnsi="Times New Roman" w:cs="Times New Roman"/>
+        </w:rPr>
+        <w:t>gere</w:t>
+      </w:r>
+      <w:proofErr w:type="spellEnd"/>
+      <w:r>
+        <w:rPr>
+          <w:rFonts w:ascii="Times New Roman" w:hAnsi="Times New Roman" w:cs="Times New Roman"/>
+        </w:rPr>
+        <w:t xml:space="preserve"> que la bande 2,4 GHz :</w:t>
       </w:r>
       <w:r>
         <w:rPr>
@@ -686,7 +812,63 @@
         <w:rPr>
           <w:rFonts w:ascii="Times New Roman" w:hAnsi="Times New Roman" w:cs="Times New Roman"/>
         </w:rPr>
-        <w:t>il ne voit pas du tout les reseaux 5 GHz, donc setup_wifi() renvoie false ("Pas de WiFi" sur le LCD).</w:t>
+        <w:t xml:space="preserve">il ne voit pas du tout les </w:t>
+      </w:r>
+      <w:proofErr w:type="spellStart"/>
+      <w:r>
+        <w:rPr>
+          <w:rFonts w:ascii="Times New Roman" w:hAnsi="Times New Roman" w:cs="Times New Roman"/>
+        </w:rPr>
+        <w:t>reseaux</w:t>
+      </w:r>
+      <w:proofErr w:type="spellEnd"/>
+      <w:r>
+        <w:rPr>
+          <w:rFonts w:ascii="Times New Roman" w:hAnsi="Times New Roman" w:cs="Times New Roman"/>
+        </w:rPr>
+        <w:t xml:space="preserve"> 5 GHz, donc </w:t>
+      </w:r>
+      <w:proofErr w:type="spellStart"/>
+      <w:r>
+        <w:rPr>
+          <w:rFonts w:ascii="Times New Roman" w:hAnsi="Times New Roman" w:cs="Times New Roman"/>
+        </w:rPr>
+        <w:t>setup_</w:t>
+      </w:r>
+      <w:proofErr w:type="gramStart"/>
+      <w:r>
+        <w:rPr>
+          <w:rFonts w:ascii="Times New Roman" w:hAnsi="Times New Roman" w:cs="Times New Roman"/>
+        </w:rPr>
+        <w:t>wifi</w:t>
+      </w:r>
+      <w:proofErr w:type="spellEnd"/>
+      <w:r>
+        <w:rPr>
+          <w:rFonts w:ascii="Times New Roman" w:hAnsi="Times New Roman" w:cs="Times New Roman"/>
+        </w:rPr>
+        <w:t>(</w:t>
+      </w:r>
+      <w:proofErr w:type="gramEnd"/>
+      <w:r>
+        <w:rPr>
+          <w:rFonts w:ascii="Times New Roman" w:hAnsi="Times New Roman" w:cs="Times New Roman"/>
+        </w:rPr>
+        <w:t xml:space="preserve">) renvoie false ("Pas de </w:t>
+      </w:r>
+      <w:proofErr w:type="spellStart"/>
+      <w:r>
+        <w:rPr>
+          <w:rFonts w:ascii="Times New Roman" w:hAnsi="Times New Roman" w:cs="Times New Roman"/>
+        </w:rPr>
+        <w:t>WiFi</w:t>
+      </w:r>
+      <w:proofErr w:type="spellEnd"/>
+      <w:r>
+        <w:rPr>
+          <w:rFonts w:ascii="Times New Roman" w:hAnsi="Times New Roman" w:cs="Times New Roman"/>
+        </w:rPr>
+        <w:t>" sur le LCD).</w:t>
       </w:r>
     </w:p>
     <w:p>
@@ -716,7 +898,7 @@
                     <pic:cNvPicPr/>
                   </pic:nvPicPr>
                   <pic:blipFill>
-                    <a:blip r:embed="rId14"/>
+                    <a:blip r:embed="rId15"/>
                     <a:stretch>
                       <a:fillRect/>
                     </a:stretch>
@@ -763,7 +945,7 @@
                     <pic:cNvPicPr/>
                   </pic:nvPicPr>
                   <pic:blipFill>
-                    <a:blip r:embed="rId15"/>
+                    <a:blip r:embed="rId16"/>
                     <a:stretch>
                       <a:fillRect/>
                     </a:stretch>
@@ -812,7 +994,7 @@
                     <pic:cNvPicPr/>
                   </pic:nvPicPr>
                   <pic:blipFill>
-                    <a:blip r:embed="rId16"/>
+                    <a:blip r:embed="rId17"/>
                     <a:stretch>
                       <a:fillRect/>
                     </a:stretch>
@@ -860,7 +1042,7 @@
                     <pic:cNvPicPr/>
                   </pic:nvPicPr>
                   <pic:blipFill>
-                    <a:blip r:embed="rId17"/>
+                    <a:blip r:embed="rId18"/>
                     <a:stretch>
                       <a:fillRect/>
                     </a:stretch>
@@ -881,6 +1063,287 @@
         </w:drawing>
       </w:r>
     </w:p>
+    <w:p>
+      <w:pPr>
+        <w:jc w:val="both"/>
+        <w:rPr>
+          <w:rFonts w:ascii="Times New Roman" w:hAnsi="Times New Roman" w:cs="Times New Roman"/>
+        </w:rPr>
+      </w:pPr>
+      <w:r>
+        <w:rPr>
+          <w:rFonts w:ascii="Times New Roman" w:hAnsi="Times New Roman" w:cs="Times New Roman"/>
+        </w:rPr>
+        <w:t xml:space="preserve">Amélioration de la communication sous MQTT : </w:t>
+      </w:r>
+    </w:p>
+    <w:p>
+      <w:pPr>
+        <w:jc w:val="both"/>
+        <w:rPr>
+          <w:rFonts w:ascii="Times New Roman" w:hAnsi="Times New Roman" w:cs="Times New Roman"/>
+        </w:rPr>
+      </w:pPr>
+      <w:r>
+        <w:rPr>
+          <w:rFonts w:ascii="Times New Roman" w:hAnsi="Times New Roman" w:cs="Times New Roman"/>
+          <w:b/>
+          <w:bCs/>
+        </w:rPr>
+        <w:t>Avant l’amélioration</w:t>
+      </w:r>
+      <w:r>
+        <w:rPr>
+          <w:rFonts w:ascii="Times New Roman" w:hAnsi="Times New Roman" w:cs="Times New Roman"/>
+        </w:rPr>
+        <w:t>, le capteur publiait les 4 topics (version, température, humidité, date) toutes les 2 secondes, même quand rien ne changeait. Cela faisait environ 120 messages par minute, dont la plupart répétaient les mêmes valeurs.</w:t>
+      </w:r>
+    </w:p>
+    <w:p>
+      <w:pPr>
+        <w:jc w:val="both"/>
+        <w:rPr>
+          <w:rFonts w:ascii="Times New Roman" w:hAnsi="Times New Roman" w:cs="Times New Roman"/>
+        </w:rPr>
+      </w:pPr>
+      <w:r>
+        <w:rPr>
+          <w:rFonts w:ascii="Times New Roman" w:hAnsi="Times New Roman" w:cs="Times New Roman"/>
+          <w:b/>
+          <w:bCs/>
+        </w:rPr>
+        <w:t>Amélioration a) :</w:t>
+      </w:r>
+      <w:r>
+        <w:rPr>
+          <w:rFonts w:ascii="Times New Roman" w:hAnsi="Times New Roman" w:cs="Times New Roman"/>
+        </w:rPr>
+        <w:t xml:space="preserve"> la version du capteur ne change jamais pendant le fonctionnement. Elle n’est donc plus envoyée en continu, mais seulement quand on demande une synchronisation NTP avec la commande 10.</w:t>
+      </w:r>
+    </w:p>
+    <w:p>
+      <w:pPr>
+        <w:jc w:val="both"/>
+        <w:rPr>
+          <w:rFonts w:ascii="Times New Roman" w:hAnsi="Times New Roman" w:cs="Times New Roman"/>
+        </w:rPr>
+      </w:pPr>
+      <w:r>
+        <w:rPr>
+          <w:rFonts w:ascii="Times New Roman" w:hAnsi="Times New Roman" w:cs="Times New Roman"/>
+          <w:b/>
+          <w:bCs/>
+        </w:rPr>
+        <w:t>Amélioration b) :</w:t>
+      </w:r>
+      <w:r>
+        <w:rPr>
+          <w:rFonts w:ascii="Times New Roman" w:hAnsi="Times New Roman" w:cs="Times New Roman"/>
+        </w:rPr>
+        <w:t xml:space="preserve"> la température, l’humidité et la date ne sont publiées que si la température ou l’humidité a changé depuis le dernier envoi. On compare au dixième près, car c’est la précision publiée : une variation plus petite n’apporte aucune information.</w:t>
+      </w:r>
+    </w:p>
+    <w:p>
+      <w:pPr>
+        <w:jc w:val="both"/>
+        <w:rPr>
+          <w:rFonts w:ascii="Times New Roman" w:hAnsi="Times New Roman" w:cs="Times New Roman"/>
+        </w:rPr>
+      </w:pPr>
+      <w:r>
+        <w:rPr>
+          <w:rFonts w:ascii="Times New Roman" w:hAnsi="Times New Roman" w:cs="Times New Roman"/>
+          <w:b/>
+          <w:bCs/>
+        </w:rPr>
+        <w:t>Pourquoi c’est utile :</w:t>
+      </w:r>
+    </w:p>
+    <w:p>
+      <w:pPr>
+        <w:numPr>
+          <w:ilvl w:val="0"/>
+          <w:numId w:val="1"/>
+        </w:numPr>
+        <w:jc w:val="both"/>
+        <w:rPr>
+          <w:rFonts w:ascii="Times New Roman" w:hAnsi="Times New Roman" w:cs="Times New Roman"/>
+        </w:rPr>
+      </w:pPr>
+      <w:r>
+        <w:rPr>
+          <w:rFonts w:ascii="Times New Roman" w:hAnsi="Times New Roman" w:cs="Times New Roman"/>
+          <w:b/>
+          <w:bCs/>
+        </w:rPr>
+        <w:lastRenderedPageBreak/>
+        <w:t>Moins de trafic réseau</w:t>
+      </w:r>
+      <w:r>
+        <w:rPr>
+          <w:rFonts w:ascii="Times New Roman" w:hAnsi="Times New Roman" w:cs="Times New Roman"/>
+        </w:rPr>
+        <w:t xml:space="preserve">, ce qui est important quand beaucoup de capteurs partagent le même </w:t>
+      </w:r>
+      <w:proofErr w:type="spellStart"/>
+      <w:r>
+        <w:rPr>
+          <w:rFonts w:ascii="Times New Roman" w:hAnsi="Times New Roman" w:cs="Times New Roman"/>
+        </w:rPr>
+        <w:t>WiFi</w:t>
+      </w:r>
+      <w:proofErr w:type="spellEnd"/>
+      <w:r>
+        <w:rPr>
+          <w:rFonts w:ascii="Times New Roman" w:hAnsi="Times New Roman" w:cs="Times New Roman"/>
+        </w:rPr>
+        <w:t xml:space="preserve"> et le même broker.</w:t>
+      </w:r>
+    </w:p>
+    <w:p>
+      <w:pPr>
+        <w:numPr>
+          <w:ilvl w:val="0"/>
+          <w:numId w:val="1"/>
+        </w:numPr>
+        <w:jc w:val="both"/>
+        <w:rPr>
+          <w:rFonts w:ascii="Times New Roman" w:hAnsi="Times New Roman" w:cs="Times New Roman"/>
+        </w:rPr>
+      </w:pPr>
+      <w:r>
+        <w:rPr>
+          <w:rFonts w:ascii="Times New Roman" w:hAnsi="Times New Roman" w:cs="Times New Roman"/>
+          <w:b/>
+          <w:bCs/>
+        </w:rPr>
+        <w:t>Moins de travail</w:t>
+      </w:r>
+      <w:r>
+        <w:rPr>
+          <w:rFonts w:ascii="Times New Roman" w:hAnsi="Times New Roman" w:cs="Times New Roman"/>
+        </w:rPr>
+        <w:t xml:space="preserve"> pour le broker et les abonnés, qui ne reçoivent que des informations nouvelles.</w:t>
+      </w:r>
+    </w:p>
+    <w:p>
+      <w:pPr>
+        <w:numPr>
+          <w:ilvl w:val="0"/>
+          <w:numId w:val="1"/>
+        </w:numPr>
+        <w:jc w:val="both"/>
+        <w:rPr>
+          <w:rFonts w:ascii="Times New Roman" w:hAnsi="Times New Roman" w:cs="Times New Roman"/>
+        </w:rPr>
+      </w:pPr>
+      <w:r>
+        <w:rPr>
+          <w:rFonts w:ascii="Times New Roman" w:hAnsi="Times New Roman" w:cs="Times New Roman"/>
+          <w:b/>
+          <w:bCs/>
+        </w:rPr>
+        <w:t>Moins d’énergie consommée</w:t>
+      </w:r>
+      <w:r>
+        <w:rPr>
+          <w:rFonts w:ascii="Times New Roman" w:hAnsi="Times New Roman" w:cs="Times New Roman"/>
+        </w:rPr>
+        <w:t xml:space="preserve"> par le capteur, puisque l’émission </w:t>
+      </w:r>
+      <w:proofErr w:type="spellStart"/>
+      <w:r>
+        <w:rPr>
+          <w:rFonts w:ascii="Times New Roman" w:hAnsi="Times New Roman" w:cs="Times New Roman"/>
+        </w:rPr>
+        <w:t>WiFi</w:t>
+      </w:r>
+      <w:proofErr w:type="spellEnd"/>
+      <w:r>
+        <w:rPr>
+          <w:rFonts w:ascii="Times New Roman" w:hAnsi="Times New Roman" w:cs="Times New Roman"/>
+        </w:rPr>
+        <w:t xml:space="preserve"> est ce qui consomme le plus. C’est important pour un objet sur batterie.</w:t>
+      </w:r>
+    </w:p>
+    <w:p>
+      <w:pPr>
+        <w:numPr>
+          <w:ilvl w:val="0"/>
+          <w:numId w:val="1"/>
+        </w:numPr>
+        <w:jc w:val="both"/>
+        <w:rPr>
+          <w:rFonts w:ascii="Times New Roman" w:hAnsi="Times New Roman" w:cs="Times New Roman"/>
+        </w:rPr>
+      </w:pPr>
+      <w:r>
+        <w:rPr>
+          <w:rFonts w:ascii="Times New Roman" w:hAnsi="Times New Roman" w:cs="Times New Roman"/>
+        </w:rPr>
+        <w:t xml:space="preserve">C’est l’esprit de MQTT, qui est un protocole </w:t>
+      </w:r>
+      <w:r>
+        <w:rPr>
+          <w:rFonts w:ascii="Times New Roman" w:hAnsi="Times New Roman" w:cs="Times New Roman"/>
+          <w:b/>
+          <w:bCs/>
+        </w:rPr>
+        <w:t>événementiel</w:t>
+      </w:r>
+      <w:r>
+        <w:rPr>
+          <w:rFonts w:ascii="Times New Roman" w:hAnsi="Times New Roman" w:cs="Times New Roman"/>
+        </w:rPr>
+        <w:t xml:space="preserve"> : on publie quand il se passe quelque chose, pas en continu.</w:t>
+      </w:r>
+    </w:p>
+    <w:p>
+      <w:pPr>
+        <w:jc w:val="both"/>
+        <w:rPr>
+          <w:rFonts w:ascii="Times New Roman" w:hAnsi="Times New Roman" w:cs="Times New Roman"/>
+        </w:rPr>
+      </w:pPr>
+      <w:r>
+        <w:rPr>
+          <w:rFonts w:ascii="Times New Roman" w:hAnsi="Times New Roman" w:cs="Times New Roman"/>
+          <w:b/>
+          <w:bCs/>
+        </w:rPr>
+        <w:t>Limite :</w:t>
+      </w:r>
+      <w:r>
+        <w:rPr>
+          <w:rFonts w:ascii="Times New Roman" w:hAnsi="Times New Roman" w:cs="Times New Roman"/>
+        </w:rPr>
+        <w:t xml:space="preserve"> si la température reste stable longtemps, un nouvel abonné ne reçoit rien jusqu’au prochain changement. On peut corriger cela en publiant avec l’option </w:t>
+      </w:r>
+      <w:proofErr w:type="spellStart"/>
+      <w:r>
+        <w:rPr>
+          <w:rFonts w:ascii="Times New Roman" w:hAnsi="Times New Roman" w:cs="Times New Roman"/>
+          <w:b/>
+          <w:bCs/>
+        </w:rPr>
+        <w:t>Retain</w:t>
+      </w:r>
+      <w:proofErr w:type="spellEnd"/>
+      <w:r>
+        <w:rPr>
+          <w:rFonts w:ascii="Times New Roman" w:hAnsi="Times New Roman" w:cs="Times New Roman"/>
+        </w:rPr>
+        <w:t>, pour que le broker garde la dernière valeur et l’envoie tout de suite à chaque nouvel abonné.</w:t>
+      </w:r>
+    </w:p>
+    <w:p>
+      <w:pPr>
+        <w:jc w:val="both"/>
+        <w:rPr>
+          <w:rFonts w:ascii="Times New Roman" w:hAnsi="Times New Roman" w:cs="Times New Roman"/>
+        </w:rPr>
+      </w:pPr>
+    </w:p>
     <w:sectPr>
       <w:pgSz w:w="11906" w:h="16838"/>
       <w:pgMar w:top="1417" w:right="1417" w:bottom="1417" w:left="1417" w:header="720" w:footer="720" w:gutter="0"/>
@@ -889,6 +1352,163 @@
     </w:sectPr>
   </w:body>
 </w:document>
+</file>
+
+<file path=word/numbering.xml><?xml version="1.0" encoding="utf-8"?>
+<w:numbering xmlns:wpc="http://schemas.microsoft.com/office/word/2010/wordprocessingCanvas" xmlns:cx="http://schemas.microsoft.com/office/drawing/2014/chartex" xmlns:cx1="http://schemas.microsoft.com/office/drawing/2015/9/8/chartex" xmlns:cx2="http://schemas.microsoft.com/office/drawing/2015/10/21/chartex" xmlns:cx3="http://schemas.microsoft.com/office/drawing/2016/5/9/chartex" xmlns:cx4="http://schemas.microsoft.com/office/drawing/2016/5/10/chartex" xmlns:cx5="http://schemas.microsoft.com/office/drawing/2016/5/11/chartex" xmlns:cx6="http://schemas.microsoft.com/office/drawing/2016/5/12/chartex" xmlns:cx7="http://schemas.microsoft.com/office/drawing/2016/5/13/chartex" xmlns:cx8="http://schemas.microsoft.com/office/drawing/2016/5/14/chartex" xmlns:mc="http://schemas.openxmlformats.org/markup-compatibility/2006" xmlns:aink="http://schemas.microsoft.com/office/drawing/2016/ink" xmlns:am3d="http://schemas.microsoft.com/office/drawing/2017/model3d" xmlns:o="urn:schemas-microsoft-com:office:office" xmlns:oel="http://schemas.microsoft.com/office/2019/extlst" xmlns:r="http://schemas.openxmlformats.org/officeDocument/2006/relationships" xmlns:m="http://schemas.openxmlformats.org/officeDocument/2006/math" xmlns:v="urn:schemas-microsoft-com:vml" xmlns:wp14="http://schemas.microsoft.com/office/word/2010/wordprocessingDrawing" xmlns:wp="http://schemas.openxmlformats.org/drawingml/2006/wordprocessingDrawing" xmlns:w10="urn:schemas-microsoft-com:office:word" xmlns:w="http://schemas.openxmlformats.org/wordprocessingml/2006/main" xmlns:w14="http://schemas.microsoft.com/office/word/2010/wordml" xmlns:w15="http://schemas.microsoft.com/office/word/2012/wordml" xmlns:w16cex="http://schemas.microsoft.com/office/word/2018/wordml/cex" xmlns:w16cid="http://schemas.microsoft.com/office/word/2016/wordml/cid" xmlns:w16="http://schemas.microsoft.com/office/word/2018/wordml" xmlns:w16du="http://schemas.microsoft.com/office/word/2023/wordml/word16du" xmlns:w16sdtdh="http://schemas.microsoft.com/office/word/2020/wordml/sdtdatahash" xmlns:w16sdtfl="http://schemas.microsoft.com/office/word/2024/wordml/sdtformatlock" xmlns:w16se="http://schemas.microsoft.com/office/word/2015/wordml/symex" xmlns:wpg="http://schemas.microsoft.com/office/word/2010/wordprocessingGroup" xmlns:wpi="http://schemas.microsoft.com/office/word/2010/wordprocessingInk" xmlns:wne="http://schemas.microsoft.com/office/word/2006/wordml" xmlns:wps="http://schemas.microsoft.com/office/word/2010/wordprocessingShape" mc:Ignorable="w14 w15 w16se w16cid w16 w16cex w16sdtdh w16sdtfl w16du wp14">
+  <w:abstractNum w:abstractNumId="0" w15:restartNumberingAfterBreak="0">
+    <w:nsid w:val="2E3B4611"/>
+    <w:multiLevelType w:val="multilevel"/>
+    <w:tmpl w:val="66869FA8"/>
+    <w:lvl w:ilvl="0">
+      <w:start w:val="1"/>
+      <w:numFmt w:val="bullet"/>
+      <w:lvlText w:val=""/>
+      <w:lvlJc w:val="left"/>
+      <w:pPr>
+        <w:tabs>
+          <w:tab w:val="num" w:pos="720"/>
+        </w:tabs>
+        <w:ind w:left="720" w:hanging="360"/>
+      </w:pPr>
+      <w:rPr>
+        <w:rFonts w:ascii="Symbol" w:hAnsi="Symbol" w:hint="default"/>
+        <w:sz w:val="20"/>
+      </w:rPr>
+    </w:lvl>
+    <w:lvl w:ilvl="1" w:tentative="1">
+      <w:start w:val="1"/>
+      <w:numFmt w:val="bullet"/>
+      <w:lvlText w:val="o"/>
+      <w:lvlJc w:val="left"/>
+      <w:pPr>
+        <w:tabs>
+          <w:tab w:val="num" w:pos="1440"/>
+        </w:tabs>
+        <w:ind w:left="1440" w:hanging="360"/>
+      </w:pPr>
+      <w:rPr>
+        <w:rFonts w:ascii="Courier New" w:hAnsi="Courier New" w:hint="default"/>
+        <w:sz w:val="20"/>
+      </w:rPr>
+    </w:lvl>
+    <w:lvl w:ilvl="2" w:tentative="1">
+      <w:start w:val="1"/>
+      <w:numFmt w:val="bullet"/>
+      <w:lvlText w:val=""/>
+      <w:lvlJc w:val="left"/>
+      <w:pPr>
+        <w:tabs>
+          <w:tab w:val="num" w:pos="2160"/>
+        </w:tabs>
+        <w:ind w:left="2160" w:hanging="360"/>
+      </w:pPr>
+      <w:rPr>
+        <w:rFonts w:ascii="Wingdings" w:hAnsi="Wingdings" w:hint="default"/>
+        <w:sz w:val="20"/>
+      </w:rPr>
+    </w:lvl>
+    <w:lvl w:ilvl="3" w:tentative="1">
+      <w:start w:val="1"/>
+      <w:numFmt w:val="bullet"/>
+      <w:lvlText w:val=""/>
+      <w:lvlJc w:val="left"/>
+      <w:pPr>
+        <w:tabs>
+          <w:tab w:val="num" w:pos="2880"/>
+        </w:tabs>
+        <w:ind w:left="2880" w:hanging="360"/>
+      </w:pPr>
+      <w:rPr>
+        <w:rFonts w:ascii="Wingdings" w:hAnsi="Wingdings" w:hint="default"/>
+        <w:sz w:val="20"/>
+      </w:rPr>
+    </w:lvl>
+    <w:lvl w:ilvl="4" w:tentative="1">
+      <w:start w:val="1"/>
+      <w:numFmt w:val="bullet"/>
+      <w:lvlText w:val=""/>
+      <w:lvlJc w:val="left"/>
+      <w:pPr>
+        <w:tabs>
+          <w:tab w:val="num" w:pos="3600"/>
+        </w:tabs>
+        <w:ind w:left="3600" w:hanging="360"/>
+      </w:pPr>
+      <w:rPr>
+        <w:rFonts w:ascii="Wingdings" w:hAnsi="Wingdings" w:hint="default"/>
+        <w:sz w:val="20"/>
+      </w:rPr>
+    </w:lvl>
+    <w:lvl w:ilvl="5" w:tentative="1">
+      <w:start w:val="1"/>
+      <w:numFmt w:val="bullet"/>
+      <w:lvlText w:val=""/>
+      <w:lvlJc w:val="left"/>
+      <w:pPr>
+        <w:tabs>
+          <w:tab w:val="num" w:pos="4320"/>
+        </w:tabs>
+        <w:ind w:left="4320" w:hanging="360"/>
+      </w:pPr>
+      <w:rPr>
+        <w:rFonts w:ascii="Wingdings" w:hAnsi="Wingdings" w:hint="default"/>
+        <w:sz w:val="20"/>
+      </w:rPr>
+    </w:lvl>
+    <w:lvl w:ilvl="6" w:tentative="1">
+      <w:start w:val="1"/>
+      <w:numFmt w:val="bullet"/>
+      <w:lvlText w:val=""/>
+      <w:lvlJc w:val="left"/>
+      <w:pPr>
+        <w:tabs>
+          <w:tab w:val="num" w:pos="5040"/>
+        </w:tabs>
+        <w:ind w:left="5040" w:hanging="360"/>
+      </w:pPr>
+      <w:rPr>
+        <w:rFonts w:ascii="Wingdings" w:hAnsi="Wingdings" w:hint="default"/>
+        <w:sz w:val="20"/>
+      </w:rPr>
+    </w:lvl>
+    <w:lvl w:ilvl="7" w:tentative="1">
+      <w:start w:val="1"/>
+      <w:numFmt w:val="bullet"/>
+      <w:lvlText w:val=""/>
+      <w:lvlJc w:val="left"/>
+      <w:pPr>
+        <w:tabs>
+          <w:tab w:val="num" w:pos="5760"/>
+        </w:tabs>
+        <w:ind w:left="5760" w:hanging="360"/>
+      </w:pPr>
+      <w:rPr>
+        <w:rFonts w:ascii="Wingdings" w:hAnsi="Wingdings" w:hint="default"/>
+        <w:sz w:val="20"/>
+      </w:rPr>
+    </w:lvl>
+    <w:lvl w:ilvl="8" w:tentative="1">
+      <w:start w:val="1"/>
+      <w:numFmt w:val="bullet"/>
+      <w:lvlText w:val=""/>
+      <w:lvlJc w:val="left"/>
+      <w:pPr>
+        <w:tabs>
+          <w:tab w:val="num" w:pos="6480"/>
+        </w:tabs>
+        <w:ind w:left="6480" w:hanging="360"/>
+      </w:pPr>
+      <w:rPr>
+        <w:rFonts w:ascii="Wingdings" w:hAnsi="Wingdings" w:hint="default"/>
+        <w:sz w:val="20"/>
+      </w:rPr>
+    </w:lvl>
+  </w:abstractNum>
+  <w:num w:numId="1" w16cid:durableId="1343358073">
+    <w:abstractNumId w:val="0"/>
+  </w:num>
+</w:numbering>
 </file>
 
 <file path=word/styles.xml><?xml version="1.0" encoding="utf-8"?>

</xml_diff>